<commit_message>
docs: improve whitepaper navigation
</commit_message>
<xml_diff>
--- a/docs/Moros-Technical-Whitepaper.docx
+++ b/docs/Moros-Technical-Whitepaper.docx
@@ -965,814 +965,968 @@
         <w:t>The paper moves from market mechanics to privacy, proofs, resolution, security, deployment, and reference appendices.</w:t>
       </w:r>
     </w:p>
-    <w:tbl>
-      <w:tblPr>
-        <w:tblW w:type="auto" w:w="0"/>
-        <w:jc w:val="center"/>
-        <w:tblLayout w:type="fixed"/>
-        <w:tblLook w:firstColumn="1" w:firstRow="1" w:lastColumn="0" w:lastRow="0" w:noHBand="0" w:noVBand="1" w:val="04A0"/>
-      </w:tblPr>
-      <w:tblGrid>
-        <w:gridCol w:w="4829"/>
-        <w:gridCol w:w="4829"/>
-      </w:tblGrid>
-      <w:tr>
-        <w:trPr>
-          <w:cantSplit/>
-        </w:trPr>
-        <w:tc>
-          <w:tcPr>
-            <w:tcW w:type="dxa" w:w="4680"/>
-            <w:tcMar>
-              <w:top w:w="95" w:type="dxa"/>
-              <w:start w:w="90" w:type="dxa"/>
-              <w:bottom w:w="95" w:type="dxa"/>
-              <w:end w:w="90" w:type="dxa"/>
-            </w:tcMar>
-            <w:tcBorders>
-              <w:bottom w:val="single" w:sz="4" w:color="E9E9E9"/>
-            </w:tcBorders>
-          </w:tcPr>
-          <w:p>
-            <w:pPr>
-              <w:spacing w:after="0"/>
-            </w:pPr>
-            <w:r>
-              <w:rPr>
-                <w:rFonts w:ascii="Arial" w:hAnsi="Arial"/>
-                <w:b w:val="0"/>
-                <w:color w:val="000000"/>
-                <w:sz w:val="17"/>
-              </w:rPr>
-              <w:t>Abstract</w:t>
-            </w:r>
-          </w:p>
-        </w:tc>
-        <w:tc>
-          <w:tcPr>
-            <w:tcW w:type="dxa" w:w="4680"/>
-            <w:tcMar>
-              <w:top w:w="95" w:type="dxa"/>
-              <w:start w:w="90" w:type="dxa"/>
-              <w:bottom w:w="95" w:type="dxa"/>
-              <w:end w:w="90" w:type="dxa"/>
-            </w:tcMar>
-            <w:tcBorders>
-              <w:bottom w:val="single" w:sz="4" w:color="E9E9E9"/>
-            </w:tcBorders>
-          </w:tcPr>
-          <w:p>
-            <w:pPr>
-              <w:spacing w:after="0"/>
-            </w:pPr>
-            <w:r>
-              <w:rPr>
-                <w:rFonts w:ascii="Arial" w:hAnsi="Arial"/>
-                <w:b w:val="0"/>
-                <w:color w:val="000000"/>
-                <w:sz w:val="17"/>
-              </w:rPr>
-              <w:t>13. Zero-knowledge system</w:t>
-            </w:r>
-          </w:p>
-        </w:tc>
-      </w:tr>
-      <w:tr>
-        <w:trPr>
-          <w:cantSplit/>
-        </w:trPr>
-        <w:tc>
-          <w:tcPr>
-            <w:tcW w:type="dxa" w:w="4680"/>
-            <w:tcMar>
-              <w:top w:w="95" w:type="dxa"/>
-              <w:start w:w="90" w:type="dxa"/>
-              <w:bottom w:w="95" w:type="dxa"/>
-              <w:end w:w="90" w:type="dxa"/>
-            </w:tcMar>
-            <w:tcBorders>
-              <w:bottom w:val="single" w:sz="4" w:color="E9E9E9"/>
-            </w:tcBorders>
-          </w:tcPr>
-          <w:p>
-            <w:pPr>
-              <w:spacing w:after="0"/>
-            </w:pPr>
-            <w:r>
-              <w:rPr>
-                <w:rFonts w:ascii="Arial" w:hAnsi="Arial"/>
-                <w:b w:val="0"/>
-                <w:color w:val="000000"/>
-                <w:sz w:val="17"/>
-              </w:rPr>
-              <w:t>1. Motivation</w:t>
-            </w:r>
-          </w:p>
-        </w:tc>
-        <w:tc>
-          <w:tcPr>
-            <w:tcW w:type="dxa" w:w="4680"/>
-            <w:tcMar>
-              <w:top w:w="95" w:type="dxa"/>
-              <w:start w:w="90" w:type="dxa"/>
-              <w:bottom w:w="95" w:type="dxa"/>
-              <w:end w:w="90" w:type="dxa"/>
-            </w:tcMar>
-            <w:tcBorders>
-              <w:bottom w:val="single" w:sz="4" w:color="E9E9E9"/>
-            </w:tcBorders>
-          </w:tcPr>
-          <w:p>
-            <w:pPr>
-              <w:spacing w:after="0"/>
-            </w:pPr>
-            <w:r>
-              <w:rPr>
-                <w:rFonts w:ascii="Arial" w:hAnsi="Arial"/>
-                <w:b w:val="0"/>
-                <w:color w:val="000000"/>
-                <w:sz w:val="17"/>
-              </w:rPr>
-              <w:t>14. Stellar settlement</w:t>
-            </w:r>
-          </w:p>
-        </w:tc>
-      </w:tr>
-      <w:tr>
-        <w:trPr>
-          <w:cantSplit/>
-        </w:trPr>
-        <w:tc>
-          <w:tcPr>
-            <w:tcW w:type="dxa" w:w="4680"/>
-            <w:tcMar>
-              <w:top w:w="95" w:type="dxa"/>
-              <w:start w:w="90" w:type="dxa"/>
-              <w:bottom w:w="95" w:type="dxa"/>
-              <w:end w:w="90" w:type="dxa"/>
-            </w:tcMar>
-            <w:tcBorders>
-              <w:bottom w:val="single" w:sz="4" w:color="E9E9E9"/>
-            </w:tcBorders>
-          </w:tcPr>
-          <w:p>
-            <w:pPr>
-              <w:spacing w:after="0"/>
-            </w:pPr>
-            <w:r>
-              <w:rPr>
-                <w:rFonts w:ascii="Arial" w:hAnsi="Arial"/>
-                <w:b w:val="0"/>
-                <w:color w:val="000000"/>
-                <w:sz w:val="17"/>
-              </w:rPr>
-              <w:t>2. System model</w:t>
-            </w:r>
-          </w:p>
-        </w:tc>
-        <w:tc>
-          <w:tcPr>
-            <w:tcW w:type="dxa" w:w="4680"/>
-            <w:tcMar>
-              <w:top w:w="95" w:type="dxa"/>
-              <w:start w:w="90" w:type="dxa"/>
-              <w:bottom w:w="95" w:type="dxa"/>
-              <w:end w:w="90" w:type="dxa"/>
-            </w:tcMar>
-            <w:tcBorders>
-              <w:bottom w:val="single" w:sz="4" w:color="E9E9E9"/>
-            </w:tcBorders>
-          </w:tcPr>
-          <w:p>
-            <w:pPr>
-              <w:spacing w:after="0"/>
-            </w:pPr>
-            <w:r>
-              <w:rPr>
-                <w:rFonts w:ascii="Arial" w:hAnsi="Arial"/>
-                <w:b w:val="0"/>
-                <w:color w:val="000000"/>
-                <w:sz w:val="17"/>
-              </w:rPr>
-              <w:t>15. Security model</w:t>
-            </w:r>
-          </w:p>
-        </w:tc>
-      </w:tr>
-      <w:tr>
-        <w:trPr>
-          <w:cantSplit/>
-        </w:trPr>
-        <w:tc>
-          <w:tcPr>
-            <w:tcW w:type="dxa" w:w="4680"/>
-            <w:tcMar>
-              <w:top w:w="95" w:type="dxa"/>
-              <w:start w:w="90" w:type="dxa"/>
-              <w:bottom w:w="95" w:type="dxa"/>
-              <w:end w:w="90" w:type="dxa"/>
-            </w:tcMar>
-            <w:tcBorders>
-              <w:bottom w:val="single" w:sz="4" w:color="E9E9E9"/>
-            </w:tcBorders>
-          </w:tcPr>
-          <w:p>
-            <w:pPr>
-              <w:spacing w:after="0"/>
-            </w:pPr>
-            <w:r>
-              <w:rPr>
-                <w:rFonts w:ascii="Arial" w:hAnsi="Arial"/>
-                <w:b w:val="0"/>
-                <w:color w:val="000000"/>
-                <w:sz w:val="17"/>
-              </w:rPr>
-              <w:t>3. Market lifecycle</w:t>
-            </w:r>
-          </w:p>
-        </w:tc>
-        <w:tc>
-          <w:tcPr>
-            <w:tcW w:type="dxa" w:w="4680"/>
-            <w:tcMar>
-              <w:top w:w="95" w:type="dxa"/>
-              <w:start w:w="90" w:type="dxa"/>
-              <w:bottom w:w="95" w:type="dxa"/>
-              <w:end w:w="90" w:type="dxa"/>
-            </w:tcMar>
-            <w:tcBorders>
-              <w:bottom w:val="single" w:sz="4" w:color="E9E9E9"/>
-            </w:tcBorders>
-          </w:tcPr>
-          <w:p>
-            <w:pPr>
-              <w:spacing w:after="0"/>
-            </w:pPr>
-            <w:r>
-              <w:rPr>
-                <w:rFonts w:ascii="Arial" w:hAnsi="Arial"/>
-                <w:b w:val="0"/>
-                <w:color w:val="000000"/>
-                <w:sz w:val="17"/>
-              </w:rPr>
-              <w:t>16. Failure modes and recovery</w:t>
-            </w:r>
-          </w:p>
-        </w:tc>
-      </w:tr>
-      <w:tr>
-        <w:trPr>
-          <w:cantSplit/>
-        </w:trPr>
-        <w:tc>
-          <w:tcPr>
-            <w:tcW w:type="dxa" w:w="4680"/>
-            <w:tcMar>
-              <w:top w:w="95" w:type="dxa"/>
-              <w:start w:w="90" w:type="dxa"/>
-              <w:bottom w:w="95" w:type="dxa"/>
-              <w:end w:w="90" w:type="dxa"/>
-            </w:tcMar>
-            <w:tcBorders>
-              <w:bottom w:val="single" w:sz="4" w:color="E9E9E9"/>
-            </w:tcBorders>
-          </w:tcPr>
-          <w:p>
-            <w:pPr>
-              <w:spacing w:after="0"/>
-            </w:pPr>
-            <w:r>
-              <w:rPr>
-                <w:rFonts w:ascii="Arial" w:hAnsi="Arial"/>
-                <w:b w:val="0"/>
-                <w:color w:val="000000"/>
-                <w:sz w:val="17"/>
-              </w:rPr>
-              <w:t>4. Binary contracts and LMSR pricing</w:t>
-            </w:r>
-          </w:p>
-        </w:tc>
-        <w:tc>
-          <w:tcPr>
-            <w:tcW w:type="dxa" w:w="4680"/>
-            <w:tcMar>
-              <w:top w:w="95" w:type="dxa"/>
-              <w:start w:w="90" w:type="dxa"/>
-              <w:bottom w:w="95" w:type="dxa"/>
-              <w:end w:w="90" w:type="dxa"/>
-            </w:tcMar>
-            <w:tcBorders>
-              <w:bottom w:val="single" w:sz="4" w:color="E9E9E9"/>
-            </w:tcBorders>
-          </w:tcPr>
-          <w:p>
-            <w:pPr>
-              <w:spacing w:after="0"/>
-            </w:pPr>
-            <w:r>
-              <w:rPr>
-                <w:rFonts w:ascii="Arial" w:hAnsi="Arial"/>
-                <w:b w:val="0"/>
-                <w:color w:val="000000"/>
-                <w:sz w:val="17"/>
-              </w:rPr>
-              <w:t>17. Mainnet deployment</w:t>
-            </w:r>
-          </w:p>
-        </w:tc>
-      </w:tr>
-      <w:tr>
-        <w:trPr>
-          <w:cantSplit/>
-        </w:trPr>
-        <w:tc>
-          <w:tcPr>
-            <w:tcW w:type="dxa" w:w="4680"/>
-            <w:tcMar>
-              <w:top w:w="95" w:type="dxa"/>
-              <w:start w:w="90" w:type="dxa"/>
-              <w:bottom w:w="95" w:type="dxa"/>
-              <w:end w:w="90" w:type="dxa"/>
-            </w:tcMar>
-            <w:tcBorders>
-              <w:bottom w:val="single" w:sz="4" w:color="E9E9E9"/>
-            </w:tcBorders>
-          </w:tcPr>
-          <w:p>
-            <w:pPr>
-              <w:spacing w:after="0"/>
-            </w:pPr>
-            <w:r>
-              <w:rPr>
-                <w:rFonts w:ascii="Arial" w:hAnsi="Arial"/>
-                <w:b w:val="0"/>
-                <w:color w:val="000000"/>
-                <w:sz w:val="17"/>
-              </w:rPr>
-              <w:t>5. Execution fees and protocol revenue</w:t>
-            </w:r>
-          </w:p>
-        </w:tc>
-        <w:tc>
-          <w:tcPr>
-            <w:tcW w:type="dxa" w:w="4680"/>
-            <w:tcMar>
-              <w:top w:w="95" w:type="dxa"/>
-              <w:start w:w="90" w:type="dxa"/>
-              <w:bottom w:w="95" w:type="dxa"/>
-              <w:end w:w="90" w:type="dxa"/>
-            </w:tcMar>
-            <w:tcBorders>
-              <w:bottom w:val="single" w:sz="4" w:color="E9E9E9"/>
-            </w:tcBorders>
-          </w:tcPr>
-          <w:p>
-            <w:pPr>
-              <w:spacing w:after="0"/>
-            </w:pPr>
-            <w:r>
-              <w:rPr>
-                <w:rFonts w:ascii="Arial" w:hAnsi="Arial"/>
-                <w:b w:val="0"/>
-                <w:color w:val="000000"/>
-                <w:sz w:val="17"/>
-              </w:rPr>
-              <w:t>18. Limitations and hardening priorities</w:t>
-            </w:r>
-          </w:p>
-        </w:tc>
-      </w:tr>
-      <w:tr>
-        <w:trPr>
-          <w:cantSplit/>
-        </w:trPr>
-        <w:tc>
-          <w:tcPr>
-            <w:tcW w:type="dxa" w:w="4680"/>
-            <w:tcMar>
-              <w:top w:w="95" w:type="dxa"/>
-              <w:start w:w="90" w:type="dxa"/>
-              <w:bottom w:w="95" w:type="dxa"/>
-              <w:end w:w="90" w:type="dxa"/>
-            </w:tcMar>
-            <w:tcBorders>
-              <w:bottom w:val="single" w:sz="4" w:color="E9E9E9"/>
-            </w:tcBorders>
-          </w:tcPr>
-          <w:p>
-            <w:pPr>
-              <w:spacing w:after="0"/>
-            </w:pPr>
-            <w:r>
-              <w:rPr>
-                <w:rFonts w:ascii="Arial" w:hAnsi="Arial"/>
-                <w:b w:val="0"/>
-                <w:color w:val="000000"/>
-                <w:sz w:val="17"/>
-              </w:rPr>
-              <w:t>6. Pooled liquidity and isolated risk</w:t>
-            </w:r>
-          </w:p>
-        </w:tc>
-        <w:tc>
-          <w:tcPr>
-            <w:tcW w:type="dxa" w:w="4680"/>
-            <w:tcMar>
-              <w:top w:w="95" w:type="dxa"/>
-              <w:start w:w="90" w:type="dxa"/>
-              <w:bottom w:w="95" w:type="dxa"/>
-              <w:end w:w="90" w:type="dxa"/>
-            </w:tcMar>
-            <w:tcBorders>
-              <w:bottom w:val="single" w:sz="4" w:color="E9E9E9"/>
-            </w:tcBorders>
-          </w:tcPr>
-          <w:p>
-            <w:pPr>
-              <w:spacing w:after="0"/>
-            </w:pPr>
-            <w:r>
-              <w:rPr>
-                <w:rFonts w:ascii="Arial" w:hAnsi="Arial"/>
-                <w:b w:val="0"/>
-                <w:color w:val="000000"/>
-                <w:sz w:val="17"/>
-              </w:rPr>
-              <w:t>19. Conclusion</w:t>
-            </w:r>
-          </w:p>
-        </w:tc>
-      </w:tr>
-      <w:tr>
-        <w:trPr>
-          <w:cantSplit/>
-        </w:trPr>
-        <w:tc>
-          <w:tcPr>
-            <w:tcW w:type="dxa" w:w="4680"/>
-            <w:tcMar>
-              <w:top w:w="95" w:type="dxa"/>
-              <w:start w:w="90" w:type="dxa"/>
-              <w:bottom w:w="95" w:type="dxa"/>
-              <w:end w:w="90" w:type="dxa"/>
-            </w:tcMar>
-            <w:tcBorders>
-              <w:bottom w:val="single" w:sz="4" w:color="E9E9E9"/>
-            </w:tcBorders>
-          </w:tcPr>
-          <w:p>
-            <w:pPr>
-              <w:spacing w:after="0"/>
-            </w:pPr>
-            <w:r>
-              <w:rPr>
-                <w:rFonts w:ascii="Arial" w:hAnsi="Arial"/>
-                <w:b w:val="0"/>
-                <w:color w:val="000000"/>
-                <w:sz w:val="17"/>
-              </w:rPr>
-              <w:t>7. Shielded USDC note system</w:t>
-            </w:r>
-          </w:p>
-        </w:tc>
-        <w:tc>
-          <w:tcPr>
-            <w:tcW w:type="dxa" w:w="4680"/>
-            <w:tcMar>
-              <w:top w:w="95" w:type="dxa"/>
-              <w:start w:w="90" w:type="dxa"/>
-              <w:bottom w:w="95" w:type="dxa"/>
-              <w:end w:w="90" w:type="dxa"/>
-            </w:tcMar>
-            <w:tcBorders>
-              <w:bottom w:val="single" w:sz="4" w:color="E9E9E9"/>
-            </w:tcBorders>
-          </w:tcPr>
-          <w:p>
-            <w:pPr>
-              <w:spacing w:after="0"/>
-            </w:pPr>
-            <w:r>
-              <w:rPr>
-                <w:rFonts w:ascii="Arial" w:hAnsi="Arial"/>
-                <w:b/>
-                <w:color w:val="000000"/>
-                <w:sz w:val="17"/>
-              </w:rPr>
-              <w:t>Appendix A. Protocol parameters</w:t>
-            </w:r>
-          </w:p>
-        </w:tc>
-      </w:tr>
-      <w:tr>
-        <w:trPr>
-          <w:cantSplit/>
-        </w:trPr>
-        <w:tc>
-          <w:tcPr>
-            <w:tcW w:type="dxa" w:w="4680"/>
-            <w:tcMar>
-              <w:top w:w="95" w:type="dxa"/>
-              <w:start w:w="90" w:type="dxa"/>
-              <w:bottom w:w="95" w:type="dxa"/>
-              <w:end w:w="90" w:type="dxa"/>
-            </w:tcMar>
-            <w:tcBorders>
-              <w:bottom w:val="single" w:sz="4" w:color="E9E9E9"/>
-            </w:tcBorders>
-          </w:tcPr>
-          <w:p>
-            <w:pPr>
-              <w:spacing w:after="0"/>
-            </w:pPr>
-            <w:r>
-              <w:rPr>
-                <w:rFonts w:ascii="Arial" w:hAnsi="Arial"/>
-                <w:b w:val="0"/>
-                <w:color w:val="000000"/>
-                <w:sz w:val="17"/>
-              </w:rPr>
-              <w:t>8. Encrypted private orders</w:t>
-            </w:r>
-          </w:p>
-        </w:tc>
-        <w:tc>
-          <w:tcPr>
-            <w:tcW w:type="dxa" w:w="4680"/>
-            <w:tcMar>
-              <w:top w:w="95" w:type="dxa"/>
-              <w:start w:w="90" w:type="dxa"/>
-              <w:bottom w:w="95" w:type="dxa"/>
-              <w:end w:w="90" w:type="dxa"/>
-            </w:tcMar>
-            <w:tcBorders>
-              <w:bottom w:val="single" w:sz="4" w:color="E9E9E9"/>
-            </w:tcBorders>
-          </w:tcPr>
-          <w:p>
-            <w:pPr>
-              <w:spacing w:after="0"/>
-            </w:pPr>
-            <w:r>
-              <w:rPr>
-                <w:rFonts w:ascii="Arial" w:hAnsi="Arial"/>
-                <w:b/>
-                <w:color w:val="000000"/>
-                <w:sz w:val="17"/>
-              </w:rPr>
-              <w:t>Appendix B. Visibility matrix</w:t>
-            </w:r>
-          </w:p>
-        </w:tc>
-      </w:tr>
-      <w:tr>
-        <w:trPr>
-          <w:cantSplit/>
-        </w:trPr>
-        <w:tc>
-          <w:tcPr>
-            <w:tcW w:type="dxa" w:w="4680"/>
-            <w:tcMar>
-              <w:top w:w="95" w:type="dxa"/>
-              <w:start w:w="90" w:type="dxa"/>
-              <w:bottom w:w="95" w:type="dxa"/>
-              <w:end w:w="90" w:type="dxa"/>
-            </w:tcMar>
-            <w:tcBorders>
-              <w:bottom w:val="single" w:sz="4" w:color="E9E9E9"/>
-            </w:tcBorders>
-          </w:tcPr>
-          <w:p>
-            <w:pPr>
-              <w:spacing w:after="0"/>
-            </w:pPr>
-            <w:r>
-              <w:rPr>
-                <w:rFonts w:ascii="Arial" w:hAnsi="Arial"/>
-                <w:b w:val="0"/>
-                <w:color w:val="000000"/>
-                <w:sz w:val="17"/>
-              </w:rPr>
-              <w:t>9. Aggregate batch proof</w:t>
-            </w:r>
-          </w:p>
-        </w:tc>
-        <w:tc>
-          <w:tcPr>
-            <w:tcW w:type="dxa" w:w="4680"/>
-            <w:tcMar>
-              <w:top w:w="95" w:type="dxa"/>
-              <w:start w:w="90" w:type="dxa"/>
-              <w:bottom w:w="95" w:type="dxa"/>
-              <w:end w:w="90" w:type="dxa"/>
-            </w:tcMar>
-            <w:tcBorders>
-              <w:bottom w:val="single" w:sz="4" w:color="E9E9E9"/>
-            </w:tcBorders>
-          </w:tcPr>
-          <w:p>
-            <w:pPr>
-              <w:spacing w:after="0"/>
-            </w:pPr>
-            <w:r>
-              <w:rPr>
-                <w:rFonts w:ascii="Arial" w:hAnsi="Arial"/>
-                <w:b/>
-                <w:color w:val="000000"/>
-                <w:sz w:val="17"/>
-              </w:rPr>
-              <w:t>Appendix C. Contract state summary</w:t>
-            </w:r>
-          </w:p>
-        </w:tc>
-      </w:tr>
-      <w:tr>
-        <w:trPr>
-          <w:cantSplit/>
-        </w:trPr>
-        <w:tc>
-          <w:tcPr>
-            <w:tcW w:type="dxa" w:w="4680"/>
-            <w:tcMar>
-              <w:top w:w="95" w:type="dxa"/>
-              <w:start w:w="90" w:type="dxa"/>
-              <w:bottom w:w="95" w:type="dxa"/>
-              <w:end w:w="90" w:type="dxa"/>
-            </w:tcMar>
-            <w:tcBorders>
-              <w:bottom w:val="single" w:sz="4" w:color="E9E9E9"/>
-            </w:tcBorders>
-          </w:tcPr>
-          <w:p>
-            <w:pPr>
-              <w:spacing w:after="0"/>
-            </w:pPr>
-            <w:r>
-              <w:rPr>
-                <w:rFonts w:ascii="Arial" w:hAnsi="Arial"/>
-                <w:b w:val="0"/>
-                <w:color w:val="000000"/>
-                <w:sz w:val="17"/>
-              </w:rPr>
-              <w:t>10. Claims, refunds, and value conservation</w:t>
-            </w:r>
-          </w:p>
-        </w:tc>
-        <w:tc>
-          <w:tcPr>
-            <w:tcW w:type="dxa" w:w="4680"/>
-            <w:tcMar>
-              <w:top w:w="95" w:type="dxa"/>
-              <w:start w:w="90" w:type="dxa"/>
-              <w:bottom w:w="95" w:type="dxa"/>
-              <w:end w:w="90" w:type="dxa"/>
-            </w:tcMar>
-            <w:tcBorders>
-              <w:bottom w:val="single" w:sz="4" w:color="E9E9E9"/>
-            </w:tcBorders>
-          </w:tcPr>
-          <w:p>
-            <w:pPr>
-              <w:spacing w:after="0"/>
-            </w:pPr>
-            <w:r>
-              <w:rPr>
-                <w:rFonts w:ascii="Arial" w:hAnsi="Arial"/>
-                <w:b/>
-                <w:color w:val="000000"/>
-                <w:sz w:val="17"/>
-              </w:rPr>
-              <w:t>Appendix D. Reference implementation inventory</w:t>
-            </w:r>
-          </w:p>
-        </w:tc>
-      </w:tr>
-      <w:tr>
-        <w:trPr>
-          <w:cantSplit/>
-        </w:trPr>
-        <w:tc>
-          <w:tcPr>
-            <w:tcW w:type="dxa" w:w="4680"/>
-            <w:tcMar>
-              <w:top w:w="95" w:type="dxa"/>
-              <w:start w:w="90" w:type="dxa"/>
-              <w:bottom w:w="95" w:type="dxa"/>
-              <w:end w:w="90" w:type="dxa"/>
-            </w:tcMar>
-            <w:tcBorders>
-              <w:bottom w:val="single" w:sz="4" w:color="E9E9E9"/>
-            </w:tcBorders>
-          </w:tcPr>
-          <w:p>
-            <w:pPr>
-              <w:spacing w:after="0"/>
-            </w:pPr>
-            <w:r>
-              <w:rPr>
-                <w:rFonts w:ascii="Arial" w:hAnsi="Arial"/>
-                <w:b w:val="0"/>
-                <w:color w:val="000000"/>
-                <w:sz w:val="17"/>
-              </w:rPr>
-              <w:t>11. Resolution and oracle routing</w:t>
-            </w:r>
-          </w:p>
-        </w:tc>
-        <w:tc>
-          <w:tcPr>
-            <w:tcW w:type="dxa" w:w="4680"/>
-            <w:tcMar>
-              <w:top w:w="95" w:type="dxa"/>
-              <w:start w:w="90" w:type="dxa"/>
-              <w:bottom w:w="95" w:type="dxa"/>
-              <w:end w:w="90" w:type="dxa"/>
-            </w:tcMar>
-            <w:tcBorders>
-              <w:bottom w:val="single" w:sz="4" w:color="E9E9E9"/>
-            </w:tcBorders>
-          </w:tcPr>
-          <w:p>
-            <w:pPr>
-              <w:spacing w:after="0"/>
-            </w:pPr>
-            <w:r>
-              <w:rPr>
-                <w:rFonts w:ascii="Arial" w:hAnsi="Arial"/>
-                <w:b w:val="0"/>
-                <w:color w:val="000000"/>
-                <w:sz w:val="17"/>
-              </w:rPr>
-              <w:t>References</w:t>
-            </w:r>
-          </w:p>
-        </w:tc>
-      </w:tr>
-      <w:tr>
-        <w:trPr>
-          <w:cantSplit/>
-        </w:trPr>
-        <w:tc>
-          <w:tcPr>
-            <w:tcW w:type="dxa" w:w="4680"/>
-            <w:tcMar>
-              <w:top w:w="95" w:type="dxa"/>
-              <w:start w:w="90" w:type="dxa"/>
-              <w:bottom w:w="95" w:type="dxa"/>
-              <w:end w:w="90" w:type="dxa"/>
-            </w:tcMar>
-            <w:tcBorders>
-              <w:bottom w:val="single" w:sz="4" w:color="E9E9E9"/>
-            </w:tcBorders>
-          </w:tcPr>
-          <w:p>
-            <w:pPr>
-              <w:spacing w:after="0"/>
-            </w:pPr>
-            <w:r>
-              <w:rPr>
-                <w:rFonts w:ascii="Arial" w:hAnsi="Arial"/>
-                <w:b w:val="0"/>
-                <w:color w:val="000000"/>
-                <w:sz w:val="17"/>
-              </w:rPr>
-              <w:t>12. Encrypted private sync</w:t>
-            </w:r>
-          </w:p>
-        </w:tc>
-        <w:tc>
-          <w:tcPr>
-            <w:tcW w:type="dxa" w:w="4680"/>
-            <w:tcMar>
-              <w:top w:w="95" w:type="dxa"/>
-              <w:start w:w="90" w:type="dxa"/>
-              <w:bottom w:w="95" w:type="dxa"/>
-              <w:end w:w="90" w:type="dxa"/>
-            </w:tcMar>
-            <w:tcBorders>
-              <w:bottom w:val="single" w:sz="4" w:color="E9E9E9"/>
-            </w:tcBorders>
-          </w:tcPr>
-          <w:p>
-            <w:pPr>
-              <w:spacing w:after="0"/>
-            </w:pPr>
-            <w:r>
-              <w:rPr>
-                <w:rFonts w:ascii="Arial" w:hAnsi="Arial"/>
-                <w:b w:val="0"/>
-                <w:color w:val="000000"/>
-                <w:sz w:val="17"/>
-              </w:rPr>
-            </w:r>
-          </w:p>
-        </w:tc>
-      </w:tr>
-    </w:tbl>
+    <w:p>
+      <w:pPr>
+        <w:keepLines/>
+        <w:spacing w:after="40" w:line="240" w:lineRule="auto"/>
+        <w:tabs>
+          <w:tab w:val="right" w:leader="dot" w:pos="9288"/>
+        </w:tabs>
+      </w:pPr>
+      <w:hyperlink w:anchor="moros_section_01" w:history="1">
+        <w:r>
+          <w:rPr>
+            <w:rFonts w:ascii="Arial" w:hAnsi="Arial"/>
+            <w:color w:val="000000"/>
+            <w:u w:val="none"/>
+            <w:sz w:val="17"/>
+          </w:rPr>
+          <w:t>Abstract</w:t>
+        </w:r>
+      </w:hyperlink>
+      <w:r>
+        <w:rPr>
+          <w:rFonts w:ascii="Arial" w:hAnsi="Arial"/>
+          <w:sz w:val="17"/>
+        </w:rPr>
+        <w:tab/>
+      </w:r>
+      <w:hyperlink w:anchor="moros_section_01" w:history="1">
+        <w:r>
+          <w:rPr>
+            <w:rFonts w:ascii="Arial" w:hAnsi="Arial"/>
+            <w:color w:val="000000"/>
+            <w:u w:val="none"/>
+            <w:sz w:val="17"/>
+          </w:rPr>
+          <w:t>4</w:t>
+        </w:r>
+      </w:hyperlink>
+    </w:p>
+    <w:p>
+      <w:pPr>
+        <w:keepLines/>
+        <w:spacing w:after="40" w:line="240" w:lineRule="auto"/>
+        <w:tabs>
+          <w:tab w:val="right" w:leader="dot" w:pos="9288"/>
+        </w:tabs>
+      </w:pPr>
+      <w:hyperlink w:anchor="moros_section_02" w:history="1">
+        <w:r>
+          <w:rPr>
+            <w:rFonts w:ascii="Arial" w:hAnsi="Arial"/>
+            <w:color w:val="000000"/>
+            <w:u w:val="none"/>
+            <w:sz w:val="17"/>
+          </w:rPr>
+          <w:t>1. Motivation</w:t>
+        </w:r>
+      </w:hyperlink>
+      <w:r>
+        <w:rPr>
+          <w:rFonts w:ascii="Arial" w:hAnsi="Arial"/>
+          <w:sz w:val="17"/>
+        </w:rPr>
+        <w:tab/>
+      </w:r>
+      <w:hyperlink w:anchor="moros_section_02" w:history="1">
+        <w:r>
+          <w:rPr>
+            <w:rFonts w:ascii="Arial" w:hAnsi="Arial"/>
+            <w:color w:val="000000"/>
+            <w:u w:val="none"/>
+            <w:sz w:val="17"/>
+          </w:rPr>
+          <w:t>5</w:t>
+        </w:r>
+      </w:hyperlink>
+    </w:p>
+    <w:p>
+      <w:pPr>
+        <w:keepLines/>
+        <w:spacing w:after="40" w:line="240" w:lineRule="auto"/>
+        <w:tabs>
+          <w:tab w:val="right" w:leader="dot" w:pos="9288"/>
+        </w:tabs>
+      </w:pPr>
+      <w:hyperlink w:anchor="moros_section_03" w:history="1">
+        <w:r>
+          <w:rPr>
+            <w:rFonts w:ascii="Arial" w:hAnsi="Arial"/>
+            <w:color w:val="000000"/>
+            <w:u w:val="none"/>
+            <w:sz w:val="17"/>
+          </w:rPr>
+          <w:t>2. System model</w:t>
+        </w:r>
+      </w:hyperlink>
+      <w:r>
+        <w:rPr>
+          <w:rFonts w:ascii="Arial" w:hAnsi="Arial"/>
+          <w:sz w:val="17"/>
+        </w:rPr>
+        <w:tab/>
+      </w:r>
+      <w:hyperlink w:anchor="moros_section_03" w:history="1">
+        <w:r>
+          <w:rPr>
+            <w:rFonts w:ascii="Arial" w:hAnsi="Arial"/>
+            <w:color w:val="000000"/>
+            <w:u w:val="none"/>
+            <w:sz w:val="17"/>
+          </w:rPr>
+          <w:t>5</w:t>
+        </w:r>
+      </w:hyperlink>
+    </w:p>
+    <w:p>
+      <w:pPr>
+        <w:keepLines/>
+        <w:spacing w:after="40" w:line="240" w:lineRule="auto"/>
+        <w:tabs>
+          <w:tab w:val="right" w:leader="dot" w:pos="9288"/>
+        </w:tabs>
+      </w:pPr>
+      <w:hyperlink w:anchor="moros_section_04" w:history="1">
+        <w:r>
+          <w:rPr>
+            <w:rFonts w:ascii="Arial" w:hAnsi="Arial"/>
+            <w:color w:val="000000"/>
+            <w:u w:val="none"/>
+            <w:sz w:val="17"/>
+          </w:rPr>
+          <w:t>3. Market lifecycle</w:t>
+        </w:r>
+      </w:hyperlink>
+      <w:r>
+        <w:rPr>
+          <w:rFonts w:ascii="Arial" w:hAnsi="Arial"/>
+          <w:sz w:val="17"/>
+        </w:rPr>
+        <w:tab/>
+      </w:r>
+      <w:hyperlink w:anchor="moros_section_04" w:history="1">
+        <w:r>
+          <w:rPr>
+            <w:rFonts w:ascii="Arial" w:hAnsi="Arial"/>
+            <w:color w:val="000000"/>
+            <w:u w:val="none"/>
+            <w:sz w:val="17"/>
+          </w:rPr>
+          <w:t>7</w:t>
+        </w:r>
+      </w:hyperlink>
+    </w:p>
+    <w:p>
+      <w:pPr>
+        <w:keepLines/>
+        <w:spacing w:after="40" w:line="240" w:lineRule="auto"/>
+        <w:tabs>
+          <w:tab w:val="right" w:leader="dot" w:pos="9288"/>
+        </w:tabs>
+      </w:pPr>
+      <w:hyperlink w:anchor="moros_section_05" w:history="1">
+        <w:r>
+          <w:rPr>
+            <w:rFonts w:ascii="Arial" w:hAnsi="Arial"/>
+            <w:color w:val="000000"/>
+            <w:u w:val="none"/>
+            <w:sz w:val="17"/>
+          </w:rPr>
+          <w:t>4. Binary contracts and LMSR pricing</w:t>
+        </w:r>
+      </w:hyperlink>
+      <w:r>
+        <w:rPr>
+          <w:rFonts w:ascii="Arial" w:hAnsi="Arial"/>
+          <w:sz w:val="17"/>
+        </w:rPr>
+        <w:tab/>
+      </w:r>
+      <w:hyperlink w:anchor="moros_section_05" w:history="1">
+        <w:r>
+          <w:rPr>
+            <w:rFonts w:ascii="Arial" w:hAnsi="Arial"/>
+            <w:color w:val="000000"/>
+            <w:u w:val="none"/>
+            <w:sz w:val="17"/>
+          </w:rPr>
+          <w:t>8</w:t>
+        </w:r>
+      </w:hyperlink>
+    </w:p>
+    <w:p>
+      <w:pPr>
+        <w:keepLines/>
+        <w:spacing w:after="40" w:line="240" w:lineRule="auto"/>
+        <w:tabs>
+          <w:tab w:val="right" w:leader="dot" w:pos="9288"/>
+        </w:tabs>
+      </w:pPr>
+      <w:hyperlink w:anchor="moros_section_06" w:history="1">
+        <w:r>
+          <w:rPr>
+            <w:rFonts w:ascii="Arial" w:hAnsi="Arial"/>
+            <w:color w:val="000000"/>
+            <w:u w:val="none"/>
+            <w:sz w:val="17"/>
+          </w:rPr>
+          <w:t>5. Execution fees and protocol revenue</w:t>
+        </w:r>
+      </w:hyperlink>
+      <w:r>
+        <w:rPr>
+          <w:rFonts w:ascii="Arial" w:hAnsi="Arial"/>
+          <w:sz w:val="17"/>
+        </w:rPr>
+        <w:tab/>
+      </w:r>
+      <w:hyperlink w:anchor="moros_section_06" w:history="1">
+        <w:r>
+          <w:rPr>
+            <w:rFonts w:ascii="Arial" w:hAnsi="Arial"/>
+            <w:color w:val="000000"/>
+            <w:u w:val="none"/>
+            <w:sz w:val="17"/>
+          </w:rPr>
+          <w:t>10</w:t>
+        </w:r>
+      </w:hyperlink>
+    </w:p>
+    <w:p>
+      <w:pPr>
+        <w:keepLines/>
+        <w:spacing w:after="40" w:line="240" w:lineRule="auto"/>
+        <w:tabs>
+          <w:tab w:val="right" w:leader="dot" w:pos="9288"/>
+        </w:tabs>
+      </w:pPr>
+      <w:hyperlink w:anchor="moros_section_07" w:history="1">
+        <w:r>
+          <w:rPr>
+            <w:rFonts w:ascii="Arial" w:hAnsi="Arial"/>
+            <w:color w:val="000000"/>
+            <w:u w:val="none"/>
+            <w:sz w:val="17"/>
+          </w:rPr>
+          <w:t>6. Pooled liquidity and isolated risk</w:t>
+        </w:r>
+      </w:hyperlink>
+      <w:r>
+        <w:rPr>
+          <w:rFonts w:ascii="Arial" w:hAnsi="Arial"/>
+          <w:sz w:val="17"/>
+        </w:rPr>
+        <w:tab/>
+      </w:r>
+      <w:hyperlink w:anchor="moros_section_07" w:history="1">
+        <w:r>
+          <w:rPr>
+            <w:rFonts w:ascii="Arial" w:hAnsi="Arial"/>
+            <w:color w:val="000000"/>
+            <w:u w:val="none"/>
+            <w:sz w:val="17"/>
+          </w:rPr>
+          <w:t>10</w:t>
+        </w:r>
+      </w:hyperlink>
+    </w:p>
+    <w:p>
+      <w:pPr>
+        <w:keepLines/>
+        <w:spacing w:after="40" w:line="240" w:lineRule="auto"/>
+        <w:tabs>
+          <w:tab w:val="right" w:leader="dot" w:pos="9288"/>
+        </w:tabs>
+      </w:pPr>
+      <w:hyperlink w:anchor="moros_section_08" w:history="1">
+        <w:r>
+          <w:rPr>
+            <w:rFonts w:ascii="Arial" w:hAnsi="Arial"/>
+            <w:color w:val="000000"/>
+            <w:u w:val="none"/>
+            <w:sz w:val="17"/>
+          </w:rPr>
+          <w:t>7. Shielded USDC note system</w:t>
+        </w:r>
+      </w:hyperlink>
+      <w:r>
+        <w:rPr>
+          <w:rFonts w:ascii="Arial" w:hAnsi="Arial"/>
+          <w:sz w:val="17"/>
+        </w:rPr>
+        <w:tab/>
+      </w:r>
+      <w:hyperlink w:anchor="moros_section_08" w:history="1">
+        <w:r>
+          <w:rPr>
+            <w:rFonts w:ascii="Arial" w:hAnsi="Arial"/>
+            <w:color w:val="000000"/>
+            <w:u w:val="none"/>
+            <w:sz w:val="17"/>
+          </w:rPr>
+          <w:t>11</w:t>
+        </w:r>
+      </w:hyperlink>
+    </w:p>
+    <w:p>
+      <w:pPr>
+        <w:keepLines/>
+        <w:spacing w:after="40" w:line="240" w:lineRule="auto"/>
+        <w:tabs>
+          <w:tab w:val="right" w:leader="dot" w:pos="9288"/>
+        </w:tabs>
+      </w:pPr>
+      <w:hyperlink w:anchor="moros_section_09" w:history="1">
+        <w:r>
+          <w:rPr>
+            <w:rFonts w:ascii="Arial" w:hAnsi="Arial"/>
+            <w:color w:val="000000"/>
+            <w:u w:val="none"/>
+            <w:sz w:val="17"/>
+          </w:rPr>
+          <w:t>8. Encrypted private orders</w:t>
+        </w:r>
+      </w:hyperlink>
+      <w:r>
+        <w:rPr>
+          <w:rFonts w:ascii="Arial" w:hAnsi="Arial"/>
+          <w:sz w:val="17"/>
+        </w:rPr>
+        <w:tab/>
+      </w:r>
+      <w:hyperlink w:anchor="moros_section_09" w:history="1">
+        <w:r>
+          <w:rPr>
+            <w:rFonts w:ascii="Arial" w:hAnsi="Arial"/>
+            <w:color w:val="000000"/>
+            <w:u w:val="none"/>
+            <w:sz w:val="17"/>
+          </w:rPr>
+          <w:t>13</w:t>
+        </w:r>
+      </w:hyperlink>
+    </w:p>
+    <w:p>
+      <w:pPr>
+        <w:keepLines/>
+        <w:spacing w:after="40" w:line="240" w:lineRule="auto"/>
+        <w:tabs>
+          <w:tab w:val="right" w:leader="dot" w:pos="9288"/>
+        </w:tabs>
+      </w:pPr>
+      <w:hyperlink w:anchor="moros_section_10" w:history="1">
+        <w:r>
+          <w:rPr>
+            <w:rFonts w:ascii="Arial" w:hAnsi="Arial"/>
+            <w:color w:val="000000"/>
+            <w:u w:val="none"/>
+            <w:sz w:val="17"/>
+          </w:rPr>
+          <w:t>9. Aggregate batch proof</w:t>
+        </w:r>
+      </w:hyperlink>
+      <w:r>
+        <w:rPr>
+          <w:rFonts w:ascii="Arial" w:hAnsi="Arial"/>
+          <w:sz w:val="17"/>
+        </w:rPr>
+        <w:tab/>
+      </w:r>
+      <w:hyperlink w:anchor="moros_section_10" w:history="1">
+        <w:r>
+          <w:rPr>
+            <w:rFonts w:ascii="Arial" w:hAnsi="Arial"/>
+            <w:color w:val="000000"/>
+            <w:u w:val="none"/>
+            <w:sz w:val="17"/>
+          </w:rPr>
+          <w:t>14</w:t>
+        </w:r>
+      </w:hyperlink>
+    </w:p>
+    <w:p>
+      <w:pPr>
+        <w:keepLines/>
+        <w:spacing w:after="40" w:line="240" w:lineRule="auto"/>
+        <w:tabs>
+          <w:tab w:val="right" w:leader="dot" w:pos="9288"/>
+        </w:tabs>
+      </w:pPr>
+      <w:hyperlink w:anchor="moros_section_11" w:history="1">
+        <w:r>
+          <w:rPr>
+            <w:rFonts w:ascii="Arial" w:hAnsi="Arial"/>
+            <w:color w:val="000000"/>
+            <w:u w:val="none"/>
+            <w:sz w:val="17"/>
+          </w:rPr>
+          <w:t>10. Claims, refunds, and value conservation</w:t>
+        </w:r>
+      </w:hyperlink>
+      <w:r>
+        <w:rPr>
+          <w:rFonts w:ascii="Arial" w:hAnsi="Arial"/>
+          <w:sz w:val="17"/>
+        </w:rPr>
+        <w:tab/>
+      </w:r>
+      <w:hyperlink w:anchor="moros_section_11" w:history="1">
+        <w:r>
+          <w:rPr>
+            <w:rFonts w:ascii="Arial" w:hAnsi="Arial"/>
+            <w:color w:val="000000"/>
+            <w:u w:val="none"/>
+            <w:sz w:val="17"/>
+          </w:rPr>
+          <w:t>15</w:t>
+        </w:r>
+      </w:hyperlink>
+    </w:p>
+    <w:p>
+      <w:pPr>
+        <w:keepLines/>
+        <w:spacing w:after="40" w:line="240" w:lineRule="auto"/>
+        <w:tabs>
+          <w:tab w:val="right" w:leader="dot" w:pos="9288"/>
+        </w:tabs>
+      </w:pPr>
+      <w:hyperlink w:anchor="moros_section_12" w:history="1">
+        <w:r>
+          <w:rPr>
+            <w:rFonts w:ascii="Arial" w:hAnsi="Arial"/>
+            <w:color w:val="000000"/>
+            <w:u w:val="none"/>
+            <w:sz w:val="17"/>
+          </w:rPr>
+          <w:t>11. Resolution and oracle routing</w:t>
+        </w:r>
+      </w:hyperlink>
+      <w:r>
+        <w:rPr>
+          <w:rFonts w:ascii="Arial" w:hAnsi="Arial"/>
+          <w:sz w:val="17"/>
+        </w:rPr>
+        <w:tab/>
+      </w:r>
+      <w:hyperlink w:anchor="moros_section_12" w:history="1">
+        <w:r>
+          <w:rPr>
+            <w:rFonts w:ascii="Arial" w:hAnsi="Arial"/>
+            <w:color w:val="000000"/>
+            <w:u w:val="none"/>
+            <w:sz w:val="17"/>
+          </w:rPr>
+          <w:t>15</w:t>
+        </w:r>
+      </w:hyperlink>
+    </w:p>
+    <w:p>
+      <w:pPr>
+        <w:keepLines/>
+        <w:spacing w:after="40" w:line="240" w:lineRule="auto"/>
+        <w:tabs>
+          <w:tab w:val="right" w:leader="dot" w:pos="9288"/>
+        </w:tabs>
+      </w:pPr>
+      <w:hyperlink w:anchor="moros_section_13" w:history="1">
+        <w:r>
+          <w:rPr>
+            <w:rFonts w:ascii="Arial" w:hAnsi="Arial"/>
+            <w:color w:val="000000"/>
+            <w:u w:val="none"/>
+            <w:sz w:val="17"/>
+          </w:rPr>
+          <w:t>12. Encrypted private sync</w:t>
+        </w:r>
+      </w:hyperlink>
+      <w:r>
+        <w:rPr>
+          <w:rFonts w:ascii="Arial" w:hAnsi="Arial"/>
+          <w:sz w:val="17"/>
+        </w:rPr>
+        <w:tab/>
+      </w:r>
+      <w:hyperlink w:anchor="moros_section_13" w:history="1">
+        <w:r>
+          <w:rPr>
+            <w:rFonts w:ascii="Arial" w:hAnsi="Arial"/>
+            <w:color w:val="000000"/>
+            <w:u w:val="none"/>
+            <w:sz w:val="17"/>
+          </w:rPr>
+          <w:t>16</w:t>
+        </w:r>
+      </w:hyperlink>
+    </w:p>
+    <w:p>
+      <w:pPr>
+        <w:keepLines/>
+        <w:spacing w:after="40" w:line="240" w:lineRule="auto"/>
+        <w:tabs>
+          <w:tab w:val="right" w:leader="dot" w:pos="9288"/>
+        </w:tabs>
+      </w:pPr>
+      <w:hyperlink w:anchor="moros_section_14" w:history="1">
+        <w:r>
+          <w:rPr>
+            <w:rFonts w:ascii="Arial" w:hAnsi="Arial"/>
+            <w:color w:val="000000"/>
+            <w:u w:val="none"/>
+            <w:sz w:val="17"/>
+          </w:rPr>
+          <w:t>13. Zero-knowledge system</w:t>
+        </w:r>
+      </w:hyperlink>
+      <w:r>
+        <w:rPr>
+          <w:rFonts w:ascii="Arial" w:hAnsi="Arial"/>
+          <w:sz w:val="17"/>
+        </w:rPr>
+        <w:tab/>
+      </w:r>
+      <w:hyperlink w:anchor="moros_section_14" w:history="1">
+        <w:r>
+          <w:rPr>
+            <w:rFonts w:ascii="Arial" w:hAnsi="Arial"/>
+            <w:color w:val="000000"/>
+            <w:u w:val="none"/>
+            <w:sz w:val="17"/>
+          </w:rPr>
+          <w:t>17</w:t>
+        </w:r>
+      </w:hyperlink>
+    </w:p>
+    <w:p>
+      <w:pPr>
+        <w:keepLines/>
+        <w:spacing w:after="40" w:line="240" w:lineRule="auto"/>
+        <w:tabs>
+          <w:tab w:val="right" w:leader="dot" w:pos="9288"/>
+        </w:tabs>
+      </w:pPr>
+      <w:hyperlink w:anchor="moros_section_15" w:history="1">
+        <w:r>
+          <w:rPr>
+            <w:rFonts w:ascii="Arial" w:hAnsi="Arial"/>
+            <w:color w:val="000000"/>
+            <w:u w:val="none"/>
+            <w:sz w:val="17"/>
+          </w:rPr>
+          <w:t>14. Stellar settlement</w:t>
+        </w:r>
+      </w:hyperlink>
+      <w:r>
+        <w:rPr>
+          <w:rFonts w:ascii="Arial" w:hAnsi="Arial"/>
+          <w:sz w:val="17"/>
+        </w:rPr>
+        <w:tab/>
+      </w:r>
+      <w:hyperlink w:anchor="moros_section_15" w:history="1">
+        <w:r>
+          <w:rPr>
+            <w:rFonts w:ascii="Arial" w:hAnsi="Arial"/>
+            <w:color w:val="000000"/>
+            <w:u w:val="none"/>
+            <w:sz w:val="17"/>
+          </w:rPr>
+          <w:t>18</w:t>
+        </w:r>
+      </w:hyperlink>
+    </w:p>
+    <w:p>
+      <w:pPr>
+        <w:keepLines/>
+        <w:spacing w:after="40" w:line="240" w:lineRule="auto"/>
+        <w:tabs>
+          <w:tab w:val="right" w:leader="dot" w:pos="9288"/>
+        </w:tabs>
+      </w:pPr>
+      <w:hyperlink w:anchor="moros_section_16" w:history="1">
+        <w:r>
+          <w:rPr>
+            <w:rFonts w:ascii="Arial" w:hAnsi="Arial"/>
+            <w:color w:val="000000"/>
+            <w:u w:val="none"/>
+            <w:sz w:val="17"/>
+          </w:rPr>
+          <w:t>15. Security model</w:t>
+        </w:r>
+      </w:hyperlink>
+      <w:r>
+        <w:rPr>
+          <w:rFonts w:ascii="Arial" w:hAnsi="Arial"/>
+          <w:sz w:val="17"/>
+        </w:rPr>
+        <w:tab/>
+      </w:r>
+      <w:hyperlink w:anchor="moros_section_16" w:history="1">
+        <w:r>
+          <w:rPr>
+            <w:rFonts w:ascii="Arial" w:hAnsi="Arial"/>
+            <w:color w:val="000000"/>
+            <w:u w:val="none"/>
+            <w:sz w:val="17"/>
+          </w:rPr>
+          <w:t>19</w:t>
+        </w:r>
+      </w:hyperlink>
+    </w:p>
+    <w:p>
+      <w:pPr>
+        <w:keepLines/>
+        <w:spacing w:after="40" w:line="240" w:lineRule="auto"/>
+        <w:tabs>
+          <w:tab w:val="right" w:leader="dot" w:pos="9288"/>
+        </w:tabs>
+      </w:pPr>
+      <w:hyperlink w:anchor="moros_section_17" w:history="1">
+        <w:r>
+          <w:rPr>
+            <w:rFonts w:ascii="Arial" w:hAnsi="Arial"/>
+            <w:color w:val="000000"/>
+            <w:u w:val="none"/>
+            <w:sz w:val="17"/>
+          </w:rPr>
+          <w:t>16. Failure modes and recovery</w:t>
+        </w:r>
+      </w:hyperlink>
+      <w:r>
+        <w:rPr>
+          <w:rFonts w:ascii="Arial" w:hAnsi="Arial"/>
+          <w:sz w:val="17"/>
+        </w:rPr>
+        <w:tab/>
+      </w:r>
+      <w:hyperlink w:anchor="moros_section_17" w:history="1">
+        <w:r>
+          <w:rPr>
+            <w:rFonts w:ascii="Arial" w:hAnsi="Arial"/>
+            <w:color w:val="000000"/>
+            <w:u w:val="none"/>
+            <w:sz w:val="17"/>
+          </w:rPr>
+          <w:t>20</w:t>
+        </w:r>
+      </w:hyperlink>
+    </w:p>
+    <w:p>
+      <w:pPr>
+        <w:keepLines/>
+        <w:spacing w:after="40" w:line="240" w:lineRule="auto"/>
+        <w:tabs>
+          <w:tab w:val="right" w:leader="dot" w:pos="9288"/>
+        </w:tabs>
+      </w:pPr>
+      <w:hyperlink w:anchor="moros_section_18" w:history="1">
+        <w:r>
+          <w:rPr>
+            <w:rFonts w:ascii="Arial" w:hAnsi="Arial"/>
+            <w:color w:val="000000"/>
+            <w:u w:val="none"/>
+            <w:sz w:val="17"/>
+          </w:rPr>
+          <w:t>17. Mainnet deployment</w:t>
+        </w:r>
+      </w:hyperlink>
+      <w:r>
+        <w:rPr>
+          <w:rFonts w:ascii="Arial" w:hAnsi="Arial"/>
+          <w:sz w:val="17"/>
+        </w:rPr>
+        <w:tab/>
+      </w:r>
+      <w:hyperlink w:anchor="moros_section_18" w:history="1">
+        <w:r>
+          <w:rPr>
+            <w:rFonts w:ascii="Arial" w:hAnsi="Arial"/>
+            <w:color w:val="000000"/>
+            <w:u w:val="none"/>
+            <w:sz w:val="17"/>
+          </w:rPr>
+          <w:t>21</w:t>
+        </w:r>
+      </w:hyperlink>
+    </w:p>
+    <w:p>
+      <w:pPr>
+        <w:keepLines/>
+        <w:spacing w:after="40" w:line="240" w:lineRule="auto"/>
+        <w:tabs>
+          <w:tab w:val="right" w:leader="dot" w:pos="9288"/>
+        </w:tabs>
+      </w:pPr>
+      <w:hyperlink w:anchor="moros_section_19" w:history="1">
+        <w:r>
+          <w:rPr>
+            <w:rFonts w:ascii="Arial" w:hAnsi="Arial"/>
+            <w:color w:val="000000"/>
+            <w:u w:val="none"/>
+            <w:sz w:val="17"/>
+          </w:rPr>
+          <w:t>18. Limitations and hardening priorities</w:t>
+        </w:r>
+      </w:hyperlink>
+      <w:r>
+        <w:rPr>
+          <w:rFonts w:ascii="Arial" w:hAnsi="Arial"/>
+          <w:sz w:val="17"/>
+        </w:rPr>
+        <w:tab/>
+      </w:r>
+      <w:hyperlink w:anchor="moros_section_19" w:history="1">
+        <w:r>
+          <w:rPr>
+            <w:rFonts w:ascii="Arial" w:hAnsi="Arial"/>
+            <w:color w:val="000000"/>
+            <w:u w:val="none"/>
+            <w:sz w:val="17"/>
+          </w:rPr>
+          <w:t>22</w:t>
+        </w:r>
+      </w:hyperlink>
+    </w:p>
+    <w:p>
+      <w:pPr>
+        <w:keepLines/>
+        <w:spacing w:after="40" w:line="240" w:lineRule="auto"/>
+        <w:tabs>
+          <w:tab w:val="right" w:leader="dot" w:pos="9288"/>
+        </w:tabs>
+      </w:pPr>
+      <w:hyperlink w:anchor="moros_section_20" w:history="1">
+        <w:r>
+          <w:rPr>
+            <w:rFonts w:ascii="Arial" w:hAnsi="Arial"/>
+            <w:color w:val="000000"/>
+            <w:u w:val="none"/>
+            <w:sz w:val="17"/>
+          </w:rPr>
+          <w:t>19. Conclusion</w:t>
+        </w:r>
+      </w:hyperlink>
+      <w:r>
+        <w:rPr>
+          <w:rFonts w:ascii="Arial" w:hAnsi="Arial"/>
+          <w:sz w:val="17"/>
+        </w:rPr>
+        <w:tab/>
+      </w:r>
+      <w:hyperlink w:anchor="moros_section_20" w:history="1">
+        <w:r>
+          <w:rPr>
+            <w:rFonts w:ascii="Arial" w:hAnsi="Arial"/>
+            <w:color w:val="000000"/>
+            <w:u w:val="none"/>
+            <w:sz w:val="17"/>
+          </w:rPr>
+          <w:t>23</w:t>
+        </w:r>
+      </w:hyperlink>
+    </w:p>
+    <w:p>
+      <w:pPr>
+        <w:keepLines/>
+        <w:spacing w:before="80" w:after="40" w:line="240" w:lineRule="auto"/>
+        <w:tabs>
+          <w:tab w:val="right" w:leader="dot" w:pos="9288"/>
+        </w:tabs>
+      </w:pPr>
+      <w:hyperlink w:anchor="moros_section_21" w:history="1">
+        <w:r>
+          <w:rPr>
+            <w:rFonts w:ascii="Arial" w:hAnsi="Arial"/>
+            <w:color w:val="000000"/>
+            <w:u w:val="none"/>
+            <w:sz w:val="17"/>
+            <w:b/>
+          </w:rPr>
+          <w:t>Appendix A. Protocol parameters</w:t>
+        </w:r>
+      </w:hyperlink>
+      <w:r>
+        <w:rPr>
+          <w:rFonts w:ascii="Arial" w:hAnsi="Arial"/>
+          <w:sz w:val="17"/>
+        </w:rPr>
+        <w:tab/>
+      </w:r>
+      <w:hyperlink w:anchor="moros_section_21" w:history="1">
+        <w:r>
+          <w:rPr>
+            <w:rFonts w:ascii="Arial" w:hAnsi="Arial"/>
+            <w:color w:val="000000"/>
+            <w:u w:val="none"/>
+            <w:sz w:val="17"/>
+            <w:b/>
+          </w:rPr>
+          <w:t>24</w:t>
+        </w:r>
+      </w:hyperlink>
+    </w:p>
+    <w:p>
+      <w:pPr>
+        <w:keepLines/>
+        <w:spacing w:after="40" w:line="240" w:lineRule="auto"/>
+        <w:tabs>
+          <w:tab w:val="right" w:leader="dot" w:pos="9288"/>
+        </w:tabs>
+      </w:pPr>
+      <w:hyperlink w:anchor="moros_section_22" w:history="1">
+        <w:r>
+          <w:rPr>
+            <w:rFonts w:ascii="Arial" w:hAnsi="Arial"/>
+            <w:color w:val="000000"/>
+            <w:u w:val="none"/>
+            <w:sz w:val="17"/>
+            <w:b/>
+          </w:rPr>
+          <w:t>Appendix B. Visibility matrix</w:t>
+        </w:r>
+      </w:hyperlink>
+      <w:r>
+        <w:rPr>
+          <w:rFonts w:ascii="Arial" w:hAnsi="Arial"/>
+          <w:sz w:val="17"/>
+        </w:rPr>
+        <w:tab/>
+      </w:r>
+      <w:hyperlink w:anchor="moros_section_22" w:history="1">
+        <w:r>
+          <w:rPr>
+            <w:rFonts w:ascii="Arial" w:hAnsi="Arial"/>
+            <w:color w:val="000000"/>
+            <w:u w:val="none"/>
+            <w:sz w:val="17"/>
+            <w:b/>
+          </w:rPr>
+          <w:t>25</w:t>
+        </w:r>
+      </w:hyperlink>
+    </w:p>
+    <w:p>
+      <w:pPr>
+        <w:keepLines/>
+        <w:spacing w:after="40" w:line="240" w:lineRule="auto"/>
+        <w:tabs>
+          <w:tab w:val="right" w:leader="dot" w:pos="9288"/>
+        </w:tabs>
+      </w:pPr>
+      <w:hyperlink w:anchor="moros_section_23" w:history="1">
+        <w:r>
+          <w:rPr>
+            <w:rFonts w:ascii="Arial" w:hAnsi="Arial"/>
+            <w:color w:val="000000"/>
+            <w:u w:val="none"/>
+            <w:sz w:val="17"/>
+            <w:b/>
+          </w:rPr>
+          <w:t>Appendix C. Contract state summary</w:t>
+        </w:r>
+      </w:hyperlink>
+      <w:r>
+        <w:rPr>
+          <w:rFonts w:ascii="Arial" w:hAnsi="Arial"/>
+          <w:sz w:val="17"/>
+        </w:rPr>
+        <w:tab/>
+      </w:r>
+      <w:hyperlink w:anchor="moros_section_23" w:history="1">
+        <w:r>
+          <w:rPr>
+            <w:rFonts w:ascii="Arial" w:hAnsi="Arial"/>
+            <w:color w:val="000000"/>
+            <w:u w:val="none"/>
+            <w:sz w:val="17"/>
+            <w:b/>
+          </w:rPr>
+          <w:t>26</w:t>
+        </w:r>
+      </w:hyperlink>
+    </w:p>
+    <w:p>
+      <w:pPr>
+        <w:keepLines/>
+        <w:spacing w:after="40" w:line="240" w:lineRule="auto"/>
+        <w:tabs>
+          <w:tab w:val="right" w:leader="dot" w:pos="9288"/>
+        </w:tabs>
+      </w:pPr>
+      <w:hyperlink w:anchor="moros_section_24" w:history="1">
+        <w:r>
+          <w:rPr>
+            <w:rFonts w:ascii="Arial" w:hAnsi="Arial"/>
+            <w:color w:val="000000"/>
+            <w:u w:val="none"/>
+            <w:sz w:val="17"/>
+            <w:b/>
+          </w:rPr>
+          <w:t>Appendix D. Reference implementation inventory</w:t>
+        </w:r>
+      </w:hyperlink>
+      <w:r>
+        <w:rPr>
+          <w:rFonts w:ascii="Arial" w:hAnsi="Arial"/>
+          <w:sz w:val="17"/>
+        </w:rPr>
+        <w:tab/>
+      </w:r>
+      <w:hyperlink w:anchor="moros_section_24" w:history="1">
+        <w:r>
+          <w:rPr>
+            <w:rFonts w:ascii="Arial" w:hAnsi="Arial"/>
+            <w:color w:val="000000"/>
+            <w:u w:val="none"/>
+            <w:sz w:val="17"/>
+            <w:b/>
+          </w:rPr>
+          <w:t>27</w:t>
+        </w:r>
+      </w:hyperlink>
+    </w:p>
+    <w:p>
+      <w:pPr>
+        <w:keepLines/>
+        <w:spacing w:before="40" w:after="40" w:line="240" w:lineRule="auto"/>
+        <w:tabs>
+          <w:tab w:val="right" w:leader="dot" w:pos="9288"/>
+        </w:tabs>
+      </w:pPr>
+      <w:hyperlink w:anchor="moros_section_25" w:history="1">
+        <w:r>
+          <w:rPr>
+            <w:rFonts w:ascii="Arial" w:hAnsi="Arial"/>
+            <w:color w:val="000000"/>
+            <w:u w:val="none"/>
+            <w:sz w:val="17"/>
+          </w:rPr>
+          <w:t>References</w:t>
+        </w:r>
+      </w:hyperlink>
+      <w:r>
+        <w:rPr>
+          <w:rFonts w:ascii="Arial" w:hAnsi="Arial"/>
+          <w:sz w:val="17"/>
+        </w:rPr>
+        <w:tab/>
+      </w:r>
+      <w:hyperlink w:anchor="moros_section_25" w:history="1">
+        <w:r>
+          <w:rPr>
+            <w:rFonts w:ascii="Arial" w:hAnsi="Arial"/>
+            <w:color w:val="000000"/>
+            <w:u w:val="none"/>
+            <w:sz w:val="17"/>
+          </w:rPr>
+          <w:t>28</w:t>
+        </w:r>
+      </w:hyperlink>
+    </w:p>
     <w:p>
       <w:pPr>
         <w:pStyle w:val="DocumentSmall"/>
-        <w:spacing w:before="240"/>
+        <w:spacing w:before="160"/>
       </w:pPr>
       <w:r>
         <w:t>References use numbered citations. Contract identifiers and hashes appear in Section 17 and the appendices.</w:t>
@@ -1797,9 +1951,11 @@
           <w:top w:val="single" w:sz="18" w:space="8" w:color="000000"/>
         </w:pBdr>
       </w:pPr>
+      <w:bookmarkStart w:id="1000" w:name="moros_section_01"/>
       <w:r>
         <w:t>Abstract</w:t>
       </w:r>
+      <w:bookmarkEnd w:id="1000"/>
     </w:p>
     <w:p>
       <w:r>
@@ -1941,9 +2097,11 @@
           <w:top w:val="single" w:sz="18" w:space="8" w:color="000000"/>
         </w:pBdr>
       </w:pPr>
+      <w:bookmarkStart w:id="1001" w:name="moros_section_02"/>
       <w:r>
         <w:t>1. Motivation</w:t>
       </w:r>
+      <w:bookmarkEnd w:id="1001"/>
     </w:p>
     <w:p>
       <w:pPr>
@@ -2294,9 +2452,11 @@
           <w:top w:val="single" w:sz="18" w:space="8" w:color="000000"/>
         </w:pBdr>
       </w:pPr>
+      <w:bookmarkStart w:id="1002" w:name="moros_section_03"/>
       <w:r>
         <w:t>2. System model</w:t>
       </w:r>
+      <w:bookmarkEnd w:id="1002"/>
     </w:p>
     <w:p>
       <w:pPr>
@@ -4652,9 +4812,11 @@
           <w:top w:val="single" w:sz="18" w:space="8" w:color="000000"/>
         </w:pBdr>
       </w:pPr>
+      <w:bookmarkStart w:id="1003" w:name="moros_section_04"/>
       <w:r>
         <w:t>3. Market lifecycle</w:t>
       </w:r>
+      <w:bookmarkEnd w:id="1003"/>
     </w:p>
     <w:p>
       <w:pPr>
@@ -5284,9 +5446,11 @@
           <w:top w:val="single" w:sz="18" w:space="8" w:color="000000"/>
         </w:pBdr>
       </w:pPr>
+      <w:bookmarkStart w:id="1004" w:name="moros_section_05"/>
       <w:r>
         <w:t>4. Binary contracts and LMSR pricing</w:t>
       </w:r>
+      <w:bookmarkEnd w:id="1004"/>
     </w:p>
     <w:p>
       <w:pPr>
@@ -6175,9 +6339,11 @@
           <w:top w:val="single" w:sz="18" w:space="8" w:color="000000"/>
         </w:pBdr>
       </w:pPr>
+      <w:bookmarkStart w:id="1005" w:name="moros_section_06"/>
       <w:r>
         <w:t>5. Execution fees and protocol revenue</w:t>
       </w:r>
+      <w:bookmarkEnd w:id="1005"/>
     </w:p>
     <w:p>
       <w:pPr>
@@ -6439,9 +6605,11 @@
           <w:top w:val="single" w:sz="18" w:space="8" w:color="000000"/>
         </w:pBdr>
       </w:pPr>
+      <w:bookmarkStart w:id="1006" w:name="moros_section_07"/>
       <w:r>
         <w:t>6. Pooled liquidity and isolated risk</w:t>
       </w:r>
+      <w:bookmarkEnd w:id="1006"/>
     </w:p>
     <w:p>
       <w:pPr>
@@ -7500,9 +7668,11 @@
           <w:top w:val="single" w:sz="18" w:space="8" w:color="000000"/>
         </w:pBdr>
       </w:pPr>
+      <w:bookmarkStart w:id="1007" w:name="moros_section_08"/>
       <w:r>
         <w:t>7. Shielded USDC note system</w:t>
       </w:r>
+      <w:bookmarkEnd w:id="1007"/>
     </w:p>
     <w:p>
       <w:pPr>
@@ -8855,9 +9025,11 @@
           <w:top w:val="single" w:sz="18" w:space="8" w:color="000000"/>
         </w:pBdr>
       </w:pPr>
+      <w:bookmarkStart w:id="1008" w:name="moros_section_09"/>
       <w:r>
         <w:t>8. Encrypted private orders</w:t>
       </w:r>
+      <w:bookmarkEnd w:id="1008"/>
     </w:p>
     <w:p>
       <w:pPr>
@@ -9427,9 +9599,11 @@
           <w:top w:val="single" w:sz="18" w:space="8" w:color="000000"/>
         </w:pBdr>
       </w:pPr>
+      <w:bookmarkStart w:id="1009" w:name="moros_section_10"/>
       <w:r>
         <w:t>9. Aggregate batch proof</w:t>
       </w:r>
+      <w:bookmarkEnd w:id="1009"/>
     </w:p>
     <w:p>
       <w:pPr>
@@ -9816,9 +9990,11 @@
           <w:top w:val="single" w:sz="18" w:space="8" w:color="000000"/>
         </w:pBdr>
       </w:pPr>
+      <w:bookmarkStart w:id="1010" w:name="moros_section_11"/>
       <w:r>
         <w:t>10. Claims, refunds, and value conservation</w:t>
       </w:r>
+      <w:bookmarkEnd w:id="1010"/>
     </w:p>
     <w:p>
       <w:pPr>
@@ -10053,9 +10229,11 @@
           <w:top w:val="single" w:sz="18" w:space="8" w:color="000000"/>
         </w:pBdr>
       </w:pPr>
+      <w:bookmarkStart w:id="1011" w:name="moros_section_12"/>
       <w:r>
         <w:t>11. Resolution and oracle routing</w:t>
       </w:r>
+      <w:bookmarkEnd w:id="1011"/>
     </w:p>
     <w:p>
       <w:pPr>
@@ -10641,9 +10819,11 @@
           <w:top w:val="single" w:sz="18" w:space="8" w:color="000000"/>
         </w:pBdr>
       </w:pPr>
+      <w:bookmarkStart w:id="1012" w:name="moros_section_13"/>
       <w:r>
         <w:t>12. Encrypted private sync</w:t>
       </w:r>
+      <w:bookmarkEnd w:id="1012"/>
     </w:p>
     <w:p>
       <w:pPr>
@@ -11057,9 +11237,11 @@
           <w:top w:val="single" w:sz="18" w:space="8" w:color="000000"/>
         </w:pBdr>
       </w:pPr>
+      <w:bookmarkStart w:id="1013" w:name="moros_section_14"/>
       <w:r>
         <w:t>13. Zero-knowledge system</w:t>
       </w:r>
+      <w:bookmarkEnd w:id="1013"/>
     </w:p>
     <w:p>
       <w:pPr>
@@ -14216,9 +14398,11 @@
           <w:top w:val="single" w:sz="18" w:space="8" w:color="000000"/>
         </w:pBdr>
       </w:pPr>
+      <w:bookmarkStart w:id="1014" w:name="moros_section_15"/>
       <w:r>
         <w:t>14. Stellar settlement</w:t>
       </w:r>
+      <w:bookmarkEnd w:id="1014"/>
     </w:p>
     <w:p>
       <w:pPr>
@@ -14539,9 +14723,11 @@
           <w:top w:val="single" w:sz="18" w:space="8" w:color="000000"/>
         </w:pBdr>
       </w:pPr>
+      <w:bookmarkStart w:id="1015" w:name="moros_section_16"/>
       <w:r>
         <w:t>15. Security model</w:t>
       </w:r>
+      <w:bookmarkEnd w:id="1015"/>
     </w:p>
     <w:p>
       <w:pPr>
@@ -16220,9 +16406,11 @@
           <w:top w:val="single" w:sz="18" w:space="8" w:color="000000"/>
         </w:pBdr>
       </w:pPr>
+      <w:bookmarkStart w:id="1016" w:name="moros_section_17"/>
       <w:r>
         <w:t>16. Failure modes and recovery</w:t>
       </w:r>
+      <w:bookmarkEnd w:id="1016"/>
     </w:p>
     <w:p>
       <w:pPr>
@@ -16428,9 +16616,11 @@
           <w:top w:val="single" w:sz="18" w:space="8" w:color="000000"/>
         </w:pBdr>
       </w:pPr>
+      <w:bookmarkStart w:id="1017" w:name="moros_section_18"/>
       <w:r>
         <w:t>17. Mainnet deployment</w:t>
       </w:r>
+      <w:bookmarkEnd w:id="1017"/>
     </w:p>
     <w:p>
       <w:pPr>
@@ -18623,9 +18813,11 @@
           <w:top w:val="single" w:sz="18" w:space="8" w:color="000000"/>
         </w:pBdr>
       </w:pPr>
+      <w:bookmarkStart w:id="1018" w:name="moros_section_19"/>
       <w:r>
         <w:t>18. Limitations and hardening priorities</w:t>
       </w:r>
+      <w:bookmarkEnd w:id="1018"/>
     </w:p>
     <w:p>
       <w:pPr>
@@ -18986,9 +19178,11 @@
           <w:top w:val="single" w:sz="18" w:space="8" w:color="000000"/>
         </w:pBdr>
       </w:pPr>
+      <w:bookmarkStart w:id="1019" w:name="moros_section_20"/>
       <w:r>
         <w:t>19. Conclusion</w:t>
       </w:r>
+      <w:bookmarkEnd w:id="1019"/>
     </w:p>
     <w:p>
       <w:r>
@@ -19063,9 +19257,11 @@
           <w:top w:val="single" w:sz="18" w:space="8" w:color="000000"/>
         </w:pBdr>
       </w:pPr>
+      <w:bookmarkStart w:id="1020" w:name="moros_section_21"/>
       <w:r>
         <w:t>Appendix A. Protocol parameters</w:t>
       </w:r>
+      <w:bookmarkEnd w:id="1020"/>
     </w:p>
     <w:tbl>
       <w:tblPr>
@@ -21331,9 +21527,11 @@
           <w:top w:val="single" w:sz="18" w:space="8" w:color="000000"/>
         </w:pBdr>
       </w:pPr>
+      <w:bookmarkStart w:id="1021" w:name="moros_section_22"/>
       <w:r>
         <w:t>Appendix B. Visibility matrix</w:t>
       </w:r>
+      <w:bookmarkEnd w:id="1021"/>
     </w:p>
     <w:tbl>
       <w:tblPr>
@@ -23439,9 +23637,11 @@
           <w:top w:val="single" w:sz="18" w:space="8" w:color="000000"/>
         </w:pBdr>
       </w:pPr>
+      <w:bookmarkStart w:id="1022" w:name="moros_section_23"/>
       <w:r>
         <w:t>Appendix C. Contract state summary</w:t>
       </w:r>
+      <w:bookmarkEnd w:id="1022"/>
     </w:p>
     <w:p>
       <w:pPr>
@@ -23736,9 +23936,11 @@
           <w:top w:val="single" w:sz="18" w:space="8" w:color="000000"/>
         </w:pBdr>
       </w:pPr>
+      <w:bookmarkStart w:id="1023" w:name="moros_section_24"/>
       <w:r>
         <w:t>Appendix D. Reference implementation inventory</w:t>
       </w:r>
+      <w:bookmarkEnd w:id="1023"/>
     </w:p>
     <w:tbl>
       <w:tblPr>
@@ -25104,9 +25306,11 @@
           <w:top w:val="single" w:sz="18" w:space="8" w:color="000000"/>
         </w:pBdr>
       </w:pPr>
+      <w:bookmarkStart w:id="1024" w:name="moros_section_25"/>
       <w:r>
         <w:t>References</w:t>
       </w:r>
+      <w:bookmarkEnd w:id="1024"/>
     </w:p>
     <w:p>
       <w:pPr>

</xml_diff>